<commit_message>
Dodana referenca bušenja za organizatore
</commit_message>
<xml_diff>
--- a/Kalnik/Materijali_za_organizatora_Kalnik.docx
+++ b/Kalnik/Materijali_za_organizatora_Kalnik.docx
@@ -9181,6 +9181,1060 @@
                 <w:b w:val="0"/>
                 <w:sz w:val="18"/>
               </w:rPr>
+            </w:r>
+          </w:p>
+        </w:tc>
+      </w:tr>
+    </w:tbl>
+    <w:p>
+      <w:pPr>
+        <w:spacing w:before="0" w:after="0"/>
+      </w:pPr>
+      <w:r>
+        <w:br w:type="page"/>
+      </w:r>
+    </w:p>
+    <w:p>
+      <w:pPr>
+        <w:spacing w:before="0" w:after="60"/>
+        <w:jc w:val="center"/>
+      </w:pPr>
+      <w:r>
+        <w:rPr>
+          <w:b/>
+          <w:sz w:val="28"/>
+        </w:rPr>
+        <w:t>Referenca bušenja — postavljanje poligona</w:t>
+      </w:r>
+    </w:p>
+    <w:p>
+      <w:pPr>
+        <w:spacing w:before="0" w:after="120"/>
+        <w:jc w:val="center"/>
+      </w:pPr>
+      <w:r>
+        <w:rPr>
+          <w:b w:val="0"/>
+          <w:sz w:val="20"/>
+        </w:rPr>
+        <w:t>Vježba orijentacije — Kalnik</w:t>
+      </w:r>
+    </w:p>
+    <w:p>
+      <w:pPr>
+        <w:spacing w:before="0" w:after="160"/>
+        <w:jc w:val="left"/>
+      </w:pPr>
+      <w:r>
+        <w:rPr>
+          <w:b w:val="0"/>
+          <w:sz w:val="18"/>
+        </w:rPr>
+        <w:t>Kod postavljanja poligona probušite ovaj papir bušačem svake kontrolne točke kako biste imali referencu uzoraka bušenja po KT-u.</w:t>
+      </w:r>
+    </w:p>
+    <w:tbl>
+      <w:tblPr>
+        <w:tblStyle w:val="TableGrid"/>
+        <w:tblW w:type="auto" w:w="0"/>
+        <w:tblLook w:firstColumn="1" w:firstRow="1" w:lastColumn="0" w:lastRow="0" w:noHBand="0" w:noVBand="1" w:val="04A0"/>
+      </w:tblPr>
+      <w:tblGrid>
+        <w:gridCol w:w="2041"/>
+        <w:gridCol w:w="2041"/>
+        <w:gridCol w:w="2041"/>
+        <w:gridCol w:w="2041"/>
+        <w:gridCol w:w="2041"/>
+      </w:tblGrid>
+      <w:tr>
+        <w:tc>
+          <w:tcPr>
+            <w:tcW w:type="dxa" w:w="1417"/>
+            <w:shd w:val="clear" w:color="auto" w:fill="BBBBBB"/>
+          </w:tcPr>
+          <w:p>
+            <w:pPr>
+              <w:spacing w:before="40" w:after="40"/>
+              <w:jc w:val="center"/>
+            </w:pPr>
+            <w:r/>
+            <w:r>
+              <w:rPr>
+                <w:b/>
+                <w:sz w:val="18"/>
+              </w:rPr>
+              <w:t>Uzorak bušenja</w:t>
+            </w:r>
+          </w:p>
+        </w:tc>
+        <w:tc>
+          <w:tcPr>
+            <w:tcW w:type="dxa" w:w="1134"/>
+            <w:shd w:val="clear" w:color="auto" w:fill="BBBBBB"/>
+          </w:tcPr>
+          <w:p>
+            <w:pPr>
+              <w:spacing w:before="40" w:after="40"/>
+              <w:jc w:val="center"/>
+            </w:pPr>
+            <w:r/>
+            <w:r>
+              <w:rPr>
+                <w:b/>
+                <w:sz w:val="18"/>
+              </w:rPr>
+              <w:t>KT</w:t>
+            </w:r>
+          </w:p>
+        </w:tc>
+        <w:tc>
+          <w:tcPr>
+            <w:tcW w:type="dxa" w:w="3118"/>
+            <w:shd w:val="clear" w:color="auto" w:fill="BBBBBB"/>
+          </w:tcPr>
+          <w:p>
+            <w:pPr>
+              <w:spacing w:before="40" w:after="40"/>
+              <w:jc w:val="center"/>
+            </w:pPr>
+            <w:r/>
+            <w:r>
+              <w:rPr>
+                <w:b/>
+                <w:sz w:val="18"/>
+              </w:rPr>
+              <w:t>Opis</w:t>
+            </w:r>
+          </w:p>
+        </w:tc>
+        <w:tc>
+          <w:tcPr>
+            <w:tcW w:type="dxa" w:w="2268"/>
+            <w:shd w:val="clear" w:color="auto" w:fill="BBBBBB"/>
+          </w:tcPr>
+          <w:p>
+            <w:pPr>
+              <w:spacing w:before="40" w:after="40"/>
+              <w:jc w:val="center"/>
+            </w:pPr>
+            <w:r/>
+            <w:r>
+              <w:rPr>
+                <w:b/>
+                <w:sz w:val="18"/>
+              </w:rPr>
+              <w:t>Koordinate (DMS)</w:t>
+            </w:r>
+          </w:p>
+        </w:tc>
+        <w:tc>
+          <w:tcPr>
+            <w:tcW w:type="dxa" w:w="2268"/>
+            <w:shd w:val="clear" w:color="auto" w:fill="BBBBBB"/>
+          </w:tcPr>
+          <w:p>
+            <w:pPr>
+              <w:spacing w:before="40" w:after="40"/>
+              <w:jc w:val="center"/>
+            </w:pPr>
+            <w:r/>
+            <w:r>
+              <w:rPr>
+                <w:b/>
+                <w:sz w:val="18"/>
+              </w:rPr>
+              <w:t>Koordinate (dec.)</w:t>
+            </w:r>
+          </w:p>
+        </w:tc>
+      </w:tr>
+      <w:tr>
+        <w:trPr>
+          <w:trHeight w:val="1247" w:hRule="exact"/>
+        </w:trPr>
+        <w:tc>
+          <w:tcPr>
+            <w:tcW w:type="dxa" w:w="1417"/>
+          </w:tcPr>
+          <w:p>
+            <w:pPr>
+              <w:spacing w:before="40" w:after="40"/>
+              <w:jc w:val="center"/>
+            </w:pPr>
+            <w:r/>
+            <w:r>
+              <w:rPr>
+                <w:b w:val="0"/>
+                <w:sz w:val="18"/>
+              </w:rPr>
+            </w:r>
+          </w:p>
+        </w:tc>
+        <w:tc>
+          <w:tcPr>
+            <w:tcW w:type="dxa" w:w="1134"/>
+          </w:tcPr>
+          <w:p>
+            <w:pPr>
+              <w:spacing w:before="40" w:after="40"/>
+              <w:jc w:val="center"/>
+            </w:pPr>
+            <w:r/>
+            <w:r>
+              <w:rPr>
+                <w:b w:val="0"/>
+                <w:sz w:val="18"/>
+              </w:rPr>
+              <w:t>KT LIA</w:t>
+            </w:r>
+          </w:p>
+        </w:tc>
+        <w:tc>
+          <w:tcPr>
+            <w:tcW w:type="dxa" w:w="3118"/>
+          </w:tcPr>
+          <w:p>
+            <w:pPr>
+              <w:spacing w:before="40" w:after="40"/>
+              <w:jc w:val="left"/>
+            </w:pPr>
+            <w:r/>
+            <w:r>
+              <w:rPr>
+                <w:b w:val="0"/>
+                <w:sz w:val="18"/>
+              </w:rPr>
+              <w:t>Raskrižje ceste i markirane pl. staze bez broja</w:t>
+            </w:r>
+          </w:p>
+        </w:tc>
+        <w:tc>
+          <w:tcPr>
+            <w:tcW w:type="dxa" w:w="2268"/>
+          </w:tcPr>
+          <w:p>
+            <w:pPr>
+              <w:spacing w:before="40" w:after="40"/>
+              <w:jc w:val="center"/>
+            </w:pPr>
+            <w:r/>
+            <w:r>
+              <w:rPr>
+                <w:b w:val="0"/>
+                <w:sz w:val="18"/>
+              </w:rPr>
+              <w:t>46°7'55.23"N 16°27'35.05"E</w:t>
+            </w:r>
+          </w:p>
+        </w:tc>
+        <w:tc>
+          <w:tcPr>
+            <w:tcW w:type="dxa" w:w="2268"/>
+          </w:tcPr>
+          <w:p>
+            <w:pPr>
+              <w:spacing w:before="40" w:after="40"/>
+              <w:jc w:val="center"/>
+            </w:pPr>
+            <w:r/>
+            <w:r>
+              <w:rPr>
+                <w:b w:val="0"/>
+                <w:sz w:val="18"/>
+              </w:rPr>
+              <w:t>46.132008, 16.459736</w:t>
+            </w:r>
+          </w:p>
+        </w:tc>
+      </w:tr>
+      <w:tr>
+        <w:trPr>
+          <w:trHeight w:val="1247" w:hRule="exact"/>
+        </w:trPr>
+        <w:tc>
+          <w:tcPr>
+            <w:tcW w:type="dxa" w:w="1417"/>
+          </w:tcPr>
+          <w:p>
+            <w:pPr>
+              <w:spacing w:before="40" w:after="40"/>
+              <w:jc w:val="center"/>
+            </w:pPr>
+            <w:r/>
+            <w:r>
+              <w:rPr>
+                <w:b w:val="0"/>
+                <w:sz w:val="18"/>
+              </w:rPr>
+            </w:r>
+          </w:p>
+        </w:tc>
+        <w:tc>
+          <w:tcPr>
+            <w:tcW w:type="dxa" w:w="1134"/>
+          </w:tcPr>
+          <w:p>
+            <w:pPr>
+              <w:spacing w:before="40" w:after="40"/>
+              <w:jc w:val="center"/>
+            </w:pPr>
+            <w:r/>
+            <w:r>
+              <w:rPr>
+                <w:b w:val="0"/>
+                <w:sz w:val="18"/>
+              </w:rPr>
+              <w:t>KT LJIA</w:t>
+            </w:r>
+          </w:p>
+        </w:tc>
+        <w:tc>
+          <w:tcPr>
+            <w:tcW w:type="dxa" w:w="3118"/>
+          </w:tcPr>
+          <w:p>
+            <w:pPr>
+              <w:spacing w:before="40" w:after="40"/>
+              <w:jc w:val="left"/>
+            </w:pPr>
+            <w:r/>
+            <w:r>
+              <w:rPr>
+                <w:b w:val="0"/>
+                <w:sz w:val="18"/>
+              </w:rPr>
+              <w:t>Vrh Vranilac</w:t>
+            </w:r>
+          </w:p>
+        </w:tc>
+        <w:tc>
+          <w:tcPr>
+            <w:tcW w:type="dxa" w:w="2268"/>
+          </w:tcPr>
+          <w:p>
+            <w:pPr>
+              <w:spacing w:before="40" w:after="40"/>
+              <w:jc w:val="center"/>
+            </w:pPr>
+            <w:r/>
+            <w:r>
+              <w:rPr>
+                <w:b w:val="0"/>
+                <w:sz w:val="18"/>
+              </w:rPr>
+              <w:t>46°7'52.60"N 16°27'16.82"E</w:t>
+            </w:r>
+          </w:p>
+        </w:tc>
+        <w:tc>
+          <w:tcPr>
+            <w:tcW w:type="dxa" w:w="2268"/>
+          </w:tcPr>
+          <w:p>
+            <w:pPr>
+              <w:spacing w:before="40" w:after="40"/>
+              <w:jc w:val="center"/>
+            </w:pPr>
+            <w:r/>
+            <w:r>
+              <w:rPr>
+                <w:b w:val="0"/>
+                <w:sz w:val="18"/>
+              </w:rPr>
+              <w:t>46.131278, 16.454672</w:t>
+            </w:r>
+          </w:p>
+        </w:tc>
+      </w:tr>
+      <w:tr>
+        <w:trPr>
+          <w:trHeight w:val="1247" w:hRule="exact"/>
+        </w:trPr>
+        <w:tc>
+          <w:tcPr>
+            <w:tcW w:type="dxa" w:w="1417"/>
+          </w:tcPr>
+          <w:p>
+            <w:pPr>
+              <w:spacing w:before="40" w:after="40"/>
+              <w:jc w:val="center"/>
+            </w:pPr>
+            <w:r/>
+            <w:r>
+              <w:rPr>
+                <w:b w:val="0"/>
+                <w:sz w:val="18"/>
+              </w:rPr>
+            </w:r>
+          </w:p>
+        </w:tc>
+        <w:tc>
+          <w:tcPr>
+            <w:tcW w:type="dxa" w:w="1134"/>
+          </w:tcPr>
+          <w:p>
+            <w:pPr>
+              <w:spacing w:before="40" w:after="40"/>
+              <w:jc w:val="center"/>
+            </w:pPr>
+            <w:r/>
+            <w:r>
+              <w:rPr>
+                <w:b w:val="0"/>
+                <w:sz w:val="18"/>
+              </w:rPr>
+              <w:t>KT LJA</w:t>
+            </w:r>
+          </w:p>
+        </w:tc>
+        <w:tc>
+          <w:tcPr>
+            <w:tcW w:type="dxa" w:w="3118"/>
+          </w:tcPr>
+          <w:p>
+            <w:pPr>
+              <w:spacing w:before="40" w:after="40"/>
+              <w:jc w:val="left"/>
+            </w:pPr>
+            <w:r/>
+            <w:r>
+              <w:rPr>
+                <w:b w:val="0"/>
+                <w:sz w:val="18"/>
+              </w:rPr>
+              <w:t>Raskrižje ceste i pl. staze 115 (alt. za KT LJIA)</w:t>
+            </w:r>
+          </w:p>
+        </w:tc>
+        <w:tc>
+          <w:tcPr>
+            <w:tcW w:type="dxa" w:w="2268"/>
+          </w:tcPr>
+          <w:p>
+            <w:pPr>
+              <w:spacing w:before="40" w:after="40"/>
+              <w:jc w:val="center"/>
+            </w:pPr>
+            <w:r/>
+            <w:r>
+              <w:rPr>
+                <w:b w:val="0"/>
+                <w:sz w:val="18"/>
+              </w:rPr>
+              <w:t>46°7'48.80"N 16°27'29.36"E</w:t>
+            </w:r>
+          </w:p>
+        </w:tc>
+        <w:tc>
+          <w:tcPr>
+            <w:tcW w:type="dxa" w:w="2268"/>
+          </w:tcPr>
+          <w:p>
+            <w:pPr>
+              <w:spacing w:before="40" w:after="40"/>
+              <w:jc w:val="center"/>
+            </w:pPr>
+            <w:r/>
+            <w:r>
+              <w:rPr>
+                <w:b w:val="0"/>
+                <w:sz w:val="18"/>
+              </w:rPr>
+              <w:t>46.130222, 16.458156</w:t>
+            </w:r>
+          </w:p>
+        </w:tc>
+      </w:tr>
+      <w:tr>
+        <w:trPr>
+          <w:trHeight w:val="1247" w:hRule="exact"/>
+        </w:trPr>
+        <w:tc>
+          <w:tcPr>
+            <w:tcW w:type="dxa" w:w="1417"/>
+          </w:tcPr>
+          <w:p>
+            <w:pPr>
+              <w:spacing w:before="40" w:after="40"/>
+              <w:jc w:val="center"/>
+            </w:pPr>
+            <w:r/>
+            <w:r>
+              <w:rPr>
+                <w:b w:val="0"/>
+                <w:sz w:val="18"/>
+              </w:rPr>
+            </w:r>
+          </w:p>
+        </w:tc>
+        <w:tc>
+          <w:tcPr>
+            <w:tcW w:type="dxa" w:w="1134"/>
+          </w:tcPr>
+          <w:p>
+            <w:pPr>
+              <w:spacing w:before="40" w:after="40"/>
+              <w:jc w:val="center"/>
+            </w:pPr>
+            <w:r/>
+            <w:r>
+              <w:rPr>
+                <w:b w:val="0"/>
+                <w:sz w:val="18"/>
+              </w:rPr>
+              <w:t>KT LZA</w:t>
+            </w:r>
+          </w:p>
+        </w:tc>
+        <w:tc>
+          <w:tcPr>
+            <w:tcW w:type="dxa" w:w="3118"/>
+          </w:tcPr>
+          <w:p>
+            <w:pPr>
+              <w:spacing w:before="40" w:after="40"/>
+              <w:jc w:val="left"/>
+            </w:pPr>
+            <w:r/>
+            <w:r>
+              <w:rPr>
+                <w:b w:val="0"/>
+                <w:sz w:val="18"/>
+              </w:rPr>
+              <w:t>Raskrižje ceste i pl. staze 101</w:t>
+            </w:r>
+          </w:p>
+        </w:tc>
+        <w:tc>
+          <w:tcPr>
+            <w:tcW w:type="dxa" w:w="2268"/>
+          </w:tcPr>
+          <w:p>
+            <w:pPr>
+              <w:spacing w:before="40" w:after="40"/>
+              <w:jc w:val="center"/>
+            </w:pPr>
+            <w:r/>
+            <w:r>
+              <w:rPr>
+                <w:b w:val="0"/>
+                <w:sz w:val="18"/>
+              </w:rPr>
+              <w:t>46°7'52.47"N 16°26'36.64"E</w:t>
+            </w:r>
+          </w:p>
+        </w:tc>
+        <w:tc>
+          <w:tcPr>
+            <w:tcW w:type="dxa" w:w="2268"/>
+          </w:tcPr>
+          <w:p>
+            <w:pPr>
+              <w:spacing w:before="40" w:after="40"/>
+              <w:jc w:val="center"/>
+            </w:pPr>
+            <w:r/>
+            <w:r>
+              <w:rPr>
+                <w:b w:val="0"/>
+                <w:sz w:val="18"/>
+              </w:rPr>
+              <w:t>46.131242, 16.443511</w:t>
+            </w:r>
+          </w:p>
+        </w:tc>
+      </w:tr>
+      <w:tr>
+        <w:trPr>
+          <w:trHeight w:val="1247" w:hRule="exact"/>
+        </w:trPr>
+        <w:tc>
+          <w:tcPr>
+            <w:tcW w:type="dxa" w:w="1417"/>
+          </w:tcPr>
+          <w:p>
+            <w:pPr>
+              <w:spacing w:before="40" w:after="40"/>
+              <w:jc w:val="center"/>
+            </w:pPr>
+            <w:r/>
+            <w:r>
+              <w:rPr>
+                <w:b w:val="0"/>
+                <w:sz w:val="18"/>
+              </w:rPr>
+            </w:r>
+          </w:p>
+        </w:tc>
+        <w:tc>
+          <w:tcPr>
+            <w:tcW w:type="dxa" w:w="1134"/>
+          </w:tcPr>
+          <w:p>
+            <w:pPr>
+              <w:spacing w:before="40" w:after="40"/>
+              <w:jc w:val="center"/>
+            </w:pPr>
+            <w:r/>
+            <w:r>
+              <w:rPr>
+                <w:b w:val="0"/>
+                <w:sz w:val="18"/>
+              </w:rPr>
+              <w:t>KT LSIA</w:t>
+            </w:r>
+          </w:p>
+        </w:tc>
+        <w:tc>
+          <w:tcPr>
+            <w:tcW w:type="dxa" w:w="3118"/>
+          </w:tcPr>
+          <w:p>
+            <w:pPr>
+              <w:spacing w:before="40" w:after="40"/>
+              <w:jc w:val="left"/>
+            </w:pPr>
+            <w:r/>
+            <w:r>
+              <w:rPr>
+                <w:b w:val="0"/>
+                <w:sz w:val="18"/>
+              </w:rPr>
+              <w:t>Raskrižje ceste i pl. staza 102 i 103</w:t>
+            </w:r>
+          </w:p>
+        </w:tc>
+        <w:tc>
+          <w:tcPr>
+            <w:tcW w:type="dxa" w:w="2268"/>
+          </w:tcPr>
+          <w:p>
+            <w:pPr>
+              <w:spacing w:before="40" w:after="40"/>
+              <w:jc w:val="center"/>
+            </w:pPr>
+            <w:r/>
+            <w:r>
+              <w:rPr>
+                <w:b w:val="0"/>
+                <w:sz w:val="18"/>
+              </w:rPr>
+              <w:t>46°8'4.89"N 16°27'27.29"E</w:t>
+            </w:r>
+          </w:p>
+        </w:tc>
+        <w:tc>
+          <w:tcPr>
+            <w:tcW w:type="dxa" w:w="2268"/>
+          </w:tcPr>
+          <w:p>
+            <w:pPr>
+              <w:spacing w:before="40" w:after="40"/>
+              <w:jc w:val="center"/>
+            </w:pPr>
+            <w:r/>
+            <w:r>
+              <w:rPr>
+                <w:b w:val="0"/>
+                <w:sz w:val="18"/>
+              </w:rPr>
+              <w:t>46.134692, 16.457581</w:t>
+            </w:r>
+          </w:p>
+        </w:tc>
+      </w:tr>
+      <w:tr>
+        <w:trPr>
+          <w:trHeight w:val="1247" w:hRule="exact"/>
+        </w:trPr>
+        <w:tc>
+          <w:tcPr>
+            <w:tcW w:type="dxa" w:w="1417"/>
+          </w:tcPr>
+          <w:p>
+            <w:pPr>
+              <w:spacing w:before="40" w:after="40"/>
+              <w:jc w:val="center"/>
+            </w:pPr>
+            <w:r/>
+            <w:r>
+              <w:rPr>
+                <w:b w:val="0"/>
+                <w:sz w:val="18"/>
+              </w:rPr>
+            </w:r>
+          </w:p>
+        </w:tc>
+        <w:tc>
+          <w:tcPr>
+            <w:tcW w:type="dxa" w:w="1134"/>
+          </w:tcPr>
+          <w:p>
+            <w:pPr>
+              <w:spacing w:before="40" w:after="40"/>
+              <w:jc w:val="center"/>
+            </w:pPr>
+            <w:r/>
+            <w:r>
+              <w:rPr>
+                <w:b w:val="0"/>
+                <w:sz w:val="18"/>
+              </w:rPr>
+              <w:t>KT DJZA</w:t>
+            </w:r>
+          </w:p>
+        </w:tc>
+        <w:tc>
+          <w:tcPr>
+            <w:tcW w:type="dxa" w:w="3118"/>
+          </w:tcPr>
+          <w:p>
+            <w:pPr>
+              <w:spacing w:before="40" w:after="40"/>
+              <w:jc w:val="left"/>
+            </w:pPr>
+            <w:r/>
+            <w:r>
+              <w:rPr>
+                <w:b w:val="0"/>
+                <w:sz w:val="18"/>
+              </w:rPr>
+              <w:t>Raskrižje pl. staza 152 i 126</w:t>
+            </w:r>
+          </w:p>
+        </w:tc>
+        <w:tc>
+          <w:tcPr>
+            <w:tcW w:type="dxa" w:w="2268"/>
+          </w:tcPr>
+          <w:p>
+            <w:pPr>
+              <w:spacing w:before="40" w:after="40"/>
+              <w:jc w:val="center"/>
+            </w:pPr>
+            <w:r/>
+            <w:r>
+              <w:rPr>
+                <w:b w:val="0"/>
+                <w:sz w:val="18"/>
+              </w:rPr>
+              <w:t>46°7'56.38"N 16°28'1.36"E</w:t>
+            </w:r>
+          </w:p>
+        </w:tc>
+        <w:tc>
+          <w:tcPr>
+            <w:tcW w:type="dxa" w:w="2268"/>
+          </w:tcPr>
+          <w:p>
+            <w:pPr>
+              <w:spacing w:before="40" w:after="40"/>
+              <w:jc w:val="center"/>
+            </w:pPr>
+            <w:r/>
+            <w:r>
+              <w:rPr>
+                <w:b w:val="0"/>
+                <w:sz w:val="18"/>
+              </w:rPr>
+              <w:t>46.132328, 16.467044</w:t>
+            </w:r>
+          </w:p>
+        </w:tc>
+      </w:tr>
+      <w:tr>
+        <w:trPr>
+          <w:trHeight w:val="1247" w:hRule="exact"/>
+        </w:trPr>
+        <w:tc>
+          <w:tcPr>
+            <w:tcW w:type="dxa" w:w="1417"/>
+          </w:tcPr>
+          <w:p>
+            <w:pPr>
+              <w:spacing w:before="40" w:after="40"/>
+              <w:jc w:val="center"/>
+            </w:pPr>
+            <w:r/>
+            <w:r>
+              <w:rPr>
+                <w:b w:val="0"/>
+                <w:sz w:val="18"/>
+              </w:rPr>
+            </w:r>
+          </w:p>
+        </w:tc>
+        <w:tc>
+          <w:tcPr>
+            <w:tcW w:type="dxa" w:w="1134"/>
+          </w:tcPr>
+          <w:p>
+            <w:pPr>
+              <w:spacing w:before="40" w:after="40"/>
+              <w:jc w:val="center"/>
+            </w:pPr>
+            <w:r/>
+            <w:r>
+              <w:rPr>
+                <w:b w:val="0"/>
+                <w:sz w:val="18"/>
+              </w:rPr>
+              <w:t>KT DIA</w:t>
+            </w:r>
+          </w:p>
+        </w:tc>
+        <w:tc>
+          <w:tcPr>
+            <w:tcW w:type="dxa" w:w="3118"/>
+          </w:tcPr>
+          <w:p>
+            <w:pPr>
+              <w:spacing w:before="40" w:after="40"/>
+              <w:jc w:val="left"/>
+            </w:pPr>
+            <w:r/>
+            <w:r>
+              <w:rPr>
+                <w:b w:val="0"/>
+                <w:sz w:val="18"/>
+              </w:rPr>
+              <w:t>Raskrižje pl. staza 152, 147 i 150</w:t>
+            </w:r>
+          </w:p>
+        </w:tc>
+        <w:tc>
+          <w:tcPr>
+            <w:tcW w:type="dxa" w:w="2268"/>
+          </w:tcPr>
+          <w:p>
+            <w:pPr>
+              <w:spacing w:before="40" w:after="40"/>
+              <w:jc w:val="center"/>
+            </w:pPr>
+            <w:r/>
+            <w:r>
+              <w:rPr>
+                <w:b w:val="0"/>
+                <w:sz w:val="18"/>
+              </w:rPr>
+              <w:t>46°8'1.19"N 16°28'21.93"E</w:t>
+            </w:r>
+          </w:p>
+        </w:tc>
+        <w:tc>
+          <w:tcPr>
+            <w:tcW w:type="dxa" w:w="2268"/>
+          </w:tcPr>
+          <w:p>
+            <w:pPr>
+              <w:spacing w:before="40" w:after="40"/>
+              <w:jc w:val="center"/>
+            </w:pPr>
+            <w:r/>
+            <w:r>
+              <w:rPr>
+                <w:b w:val="0"/>
+                <w:sz w:val="18"/>
+              </w:rPr>
+              <w:t>46.133664, 16.472758</w:t>
+            </w:r>
+          </w:p>
+        </w:tc>
+      </w:tr>
+      <w:tr>
+        <w:trPr>
+          <w:trHeight w:val="1247" w:hRule="exact"/>
+        </w:trPr>
+        <w:tc>
+          <w:tcPr>
+            <w:tcW w:type="dxa" w:w="1417"/>
+          </w:tcPr>
+          <w:p>
+            <w:pPr>
+              <w:spacing w:before="40" w:after="40"/>
+              <w:jc w:val="center"/>
+            </w:pPr>
+            <w:r/>
+            <w:r>
+              <w:rPr>
+                <w:b w:val="0"/>
+                <w:sz w:val="18"/>
+              </w:rPr>
+            </w:r>
+          </w:p>
+        </w:tc>
+        <w:tc>
+          <w:tcPr>
+            <w:tcW w:type="dxa" w:w="1134"/>
+          </w:tcPr>
+          <w:p>
+            <w:pPr>
+              <w:spacing w:before="40" w:after="40"/>
+              <w:jc w:val="center"/>
+            </w:pPr>
+            <w:r/>
+            <w:r>
+              <w:rPr>
+                <w:b w:val="0"/>
+                <w:sz w:val="18"/>
+              </w:rPr>
+              <w:t>KT DSZA</w:t>
+            </w:r>
+          </w:p>
+        </w:tc>
+        <w:tc>
+          <w:tcPr>
+            <w:tcW w:type="dxa" w:w="3118"/>
+          </w:tcPr>
+          <w:p>
+            <w:pPr>
+              <w:spacing w:before="40" w:after="40"/>
+              <w:jc w:val="left"/>
+            </w:pPr>
+            <w:r/>
+            <w:r>
+              <w:rPr>
+                <w:b w:val="0"/>
+                <w:sz w:val="18"/>
+              </w:rPr>
+              <w:t>Raskrižje pl. staza 123 i markirane pl. staze bez broja</w:t>
+            </w:r>
+          </w:p>
+        </w:tc>
+        <w:tc>
+          <w:tcPr>
+            <w:tcW w:type="dxa" w:w="2268"/>
+          </w:tcPr>
+          <w:p>
+            <w:pPr>
+              <w:spacing w:before="40" w:after="40"/>
+              <w:jc w:val="center"/>
+            </w:pPr>
+            <w:r/>
+            <w:r>
+              <w:rPr>
+                <w:b w:val="0"/>
+                <w:sz w:val="18"/>
+              </w:rPr>
+              <w:t>46°8'6.69"N 16°28'7.08"E</w:t>
+            </w:r>
+          </w:p>
+        </w:tc>
+        <w:tc>
+          <w:tcPr>
+            <w:tcW w:type="dxa" w:w="2268"/>
+          </w:tcPr>
+          <w:p>
+            <w:pPr>
+              <w:spacing w:before="40" w:after="40"/>
+              <w:jc w:val="center"/>
+            </w:pPr>
+            <w:r/>
+            <w:r>
+              <w:rPr>
+                <w:b w:val="0"/>
+                <w:sz w:val="18"/>
+              </w:rPr>
+              <w:t>46.135192, 16.468633</w:t>
+            </w:r>
+          </w:p>
+        </w:tc>
+      </w:tr>
+      <w:tr>
+        <w:trPr>
+          <w:trHeight w:val="1247" w:hRule="exact"/>
+        </w:trPr>
+        <w:tc>
+          <w:tcPr>
+            <w:tcW w:type="dxa" w:w="1417"/>
+          </w:tcPr>
+          <w:p>
+            <w:pPr>
+              <w:spacing w:before="40" w:after="40"/>
+              <w:jc w:val="center"/>
+            </w:pPr>
+            <w:r/>
+            <w:r>
+              <w:rPr>
+                <w:b w:val="0"/>
+                <w:sz w:val="18"/>
+              </w:rPr>
+            </w:r>
+          </w:p>
+        </w:tc>
+        <w:tc>
+          <w:tcPr>
+            <w:tcW w:type="dxa" w:w="1134"/>
+          </w:tcPr>
+          <w:p>
+            <w:pPr>
+              <w:spacing w:before="40" w:after="40"/>
+              <w:jc w:val="center"/>
+            </w:pPr>
+            <w:r/>
+            <w:r>
+              <w:rPr>
+                <w:b w:val="0"/>
+                <w:sz w:val="18"/>
+              </w:rPr>
+              <w:t>KT DZA</w:t>
+            </w:r>
+          </w:p>
+        </w:tc>
+        <w:tc>
+          <w:tcPr>
+            <w:tcW w:type="dxa" w:w="3118"/>
+          </w:tcPr>
+          <w:p>
+            <w:pPr>
+              <w:spacing w:before="40" w:after="40"/>
+              <w:jc w:val="left"/>
+            </w:pPr>
+            <w:r/>
+            <w:r>
+              <w:rPr>
+                <w:b w:val="0"/>
+                <w:sz w:val="18"/>
+              </w:rPr>
+              <w:t>Raskrižje pl. staza 123 i 127</w:t>
+            </w:r>
+          </w:p>
+        </w:tc>
+        <w:tc>
+          <w:tcPr>
+            <w:tcW w:type="dxa" w:w="2268"/>
+          </w:tcPr>
+          <w:p>
+            <w:pPr>
+              <w:spacing w:before="40" w:after="40"/>
+              <w:jc w:val="center"/>
+            </w:pPr>
+            <w:r/>
+            <w:r>
+              <w:rPr>
+                <w:b w:val="0"/>
+                <w:sz w:val="18"/>
+              </w:rPr>
+              <w:t>46°8'1.11"N 16°27'58.07"E</w:t>
+            </w:r>
+          </w:p>
+        </w:tc>
+        <w:tc>
+          <w:tcPr>
+            <w:tcW w:type="dxa" w:w="2268"/>
+          </w:tcPr>
+          <w:p>
+            <w:pPr>
+              <w:spacing w:before="40" w:after="40"/>
+              <w:jc w:val="center"/>
+            </w:pPr>
+            <w:r/>
+            <w:r>
+              <w:rPr>
+                <w:b w:val="0"/>
+                <w:sz w:val="18"/>
+              </w:rPr>
+              <w:t>46.133642, 16.466131</w:t>
             </w:r>
           </w:p>
         </w:tc>

</xml_diff>